<commit_message>
Provide code and raw outputs as supplementary files S1 and S2; update submission files
Co-Authored-By: Claude Sonnet 5.5 <noreply@anthropic.com>
Claude-Session: https://claude.ai/code/session_01EgyYKg5xmvfWgoXE7s255Z
</commit_message>
<xml_diff>
--- a/jmis/submission/2_title_page.docx
+++ b/jmis/submission/2_title_page.docx
@@ -79,7 +79,7 @@
         <w:pStyle w:val="BodyText"/>
       </w:pPr>
       <w:r>
-        <w:t xml:space="preserve">Main text (Sections 1 to 8, with tables, without the reference list): about 8,079 words. Online appendix: separate file. The abstract has 138 words.</w:t>
+        <w:t xml:space="preserve">Main text (Sections 1 to 8, with tables, without the reference list): about 8,082 words. Online appendix: separate file. The abstract has 138 words.</w:t>
       </w:r>
     </w:p>
     <w:p>
@@ -143,7 +143,7 @@
         <w:pStyle w:val="BodyText"/>
       </w:pPr>
       <w:r>
-        <w:t xml:space="preserve">The item bank, prompts, audit program, runner, raw model outputs (176,400 calls), analysis code and results are provided as an anonymized replication package [link to be added]; a public repository will replace the anonymized link if the paper is accepted.</w:t>
+        <w:t xml:space="preserve">The item bank, prompts, audit program, runner, raw model outputs (176,400 calls), analysis code and results are provided as anonymized supplementary files (S1: code, item bank and results; S2: raw model outputs); a public repository will replace them if the paper is accepted.</w:t>
       </w:r>
     </w:p>
     <w:p>

</xml_diff>